<commit_message>
fix: remove blank ISP points and use each counselor contact v1.5.1
</commit_message>
<xml_diff>
--- a/templates/teacher-isp-summary-template.docx
+++ b/templates/teacher-isp-summary-template.docx
@@ -419,104 +419,6 @@
         <w:pStyle w:val="a7"/>
         <w:numPr>
           <w:ilvl w:val="0"/>
-          <w:numId w:val="14"/>
-        </w:numPr>
-        <w:tabs>
-          <w:tab w:val="num" w:pos="426"/>
-        </w:tabs>
-        <w:ind w:left="426" w:hanging="426"/>
-        <w:rPr>
-          <w:rFonts w:ascii="標楷體" w:eastAsia="標楷體" w:hAnsi="標楷體" w:hint="eastAsia"/>
-          <w:bCs/>
-          <w:color w:val="000000"/>
-          <w:szCs w:val="24"/>
-        </w:rPr>
-        <w:jc w:val="both"/>
-      </w:pPr>
-      <w:r>
-        <w:rPr>
-          <w:rFonts w:ascii="標楷體" w:eastAsia="標楷體" w:hAnsi="標楷體" w:hint="eastAsia"/>
-          <w:bCs/>
-          <w:color w:val="000000"/>
-          <w:szCs w:val="24"/>
-        </w:rPr>
-        <w:t>{#status6}{text}{/status6}</w:t>
-      </w:r>
-      <w:proofErr w:type="gramStart"/>
-      <w:r>
-        <w:rPr>
-          <w:rFonts w:ascii="標楷體" w:eastAsia="標楷體" w:hAnsi="標楷體" w:hint="eastAsia"/>
-          <w:bCs/>
-          <w:color w:val="000000"/>
-          <w:szCs w:val="24"/>
-        </w:rPr>
-        <w:t/>
-      </w:r>
-      <w:proofErr w:type="gramEnd"/>
-      <w:r>
-        <w:rPr>
-          <w:rFonts w:ascii="標楷體" w:eastAsia="標楷體" w:hAnsi="標楷體" w:hint="eastAsia"/>
-          <w:bCs/>
-          <w:color w:val="000000"/>
-          <w:szCs w:val="24"/>
-        </w:rPr>
-        <w:t/>
-      </w:r>
-      <w:proofErr w:type="gramStart"/>
-      <w:r>
-        <w:rPr>
-          <w:rFonts w:ascii="標楷體" w:eastAsia="標楷體" w:hAnsi="標楷體" w:hint="eastAsia"/>
-          <w:bCs/>
-          <w:color w:val="000000"/>
-          <w:szCs w:val="24"/>
-        </w:rPr>
-        <w:t/>
-      </w:r>
-      <w:proofErr w:type="gramEnd"/>
-      <w:r>
-        <w:rPr>
-          <w:rFonts w:ascii="標楷體" w:eastAsia="標楷體" w:hAnsi="標楷體" w:hint="eastAsia"/>
-          <w:bCs/>
-          <w:color w:val="000000"/>
-          <w:szCs w:val="24"/>
-        </w:rPr>
-        <w:t/>
-      </w:r>
-    </w:p>
-    <w:p>
-      <w:pPr>
-        <w:pStyle w:val="a7"/>
-        <w:numPr>
-          <w:ilvl w:val="0"/>
-          <w:numId w:val="14"/>
-        </w:numPr>
-        <w:tabs>
-          <w:tab w:val="num" w:pos="426"/>
-        </w:tabs>
-        <w:ind w:left="426" w:hanging="426"/>
-        <w:rPr>
-          <w:rFonts w:ascii="標楷體" w:eastAsia="標楷體" w:hAnsi="標楷體"/>
-          <w:bCs/>
-          <w:color w:val="000000"/>
-          <w:szCs w:val="24"/>
-        </w:rPr>
-        <w:jc w:val="both"/>
-      </w:pPr>
-      <w:r>
-        <w:rPr>
-          <w:rFonts w:ascii="標楷體" w:eastAsia="標楷體" w:hAnsi="標楷體" w:hint="eastAsia"/>
-          <w:bCs/>
-          <w:color w:val="000000"/>
-          <w:szCs w:val="24"/>
-        </w:rPr>
-        <w:t>{#status7}{text}{/status7}</w:t>
-      </w:r>
-    </w:p>
-    <w:p>
-      <w:pPr>
-        <w:pStyle w:val="a7"/>
-        <w:numPr>
-          <w:ilvl w:val="0"/>
           <w:numId w:val="6"/>
         </w:numPr>
         <w:spacing w:beforeLines="50" w:before="180" w:line="500" w:lineRule="exact"/>
@@ -692,41 +594,8 @@
     <w:p>
       <w:pPr>
         <w:pStyle w:val="a7"/>
-        <w:numPr>
-          <w:ilvl w:val="0"/>
-          <w:numId w:val="12"/>
-        </w:numPr>
-        <w:tabs>
-          <w:tab w:val="num" w:pos="426"/>
-        </w:tabs>
-        <w:ind w:left="426" w:hanging="426"/>
-        <w:rPr>
-          <w:rFonts w:ascii="標楷體" w:eastAsia="標楷體" w:hAnsi="標楷體" w:hint="eastAsia"/>
-          <w:bCs/>
-          <w:color w:val="000000"/>
-          <w:szCs w:val="24"/>
-        </w:rPr>
-        <w:jc w:val="both"/>
-      </w:pPr>
-      <w:r>
-        <w:rPr>
-          <w:rFonts w:ascii="標楷體" w:eastAsia="標楷體" w:hAnsi="標楷體" w:hint="eastAsia"/>
-          <w:bCs/>
-          <w:color w:val="000000"/>
-          <w:szCs w:val="24"/>
-        </w:rPr>
-        <w:t>{#strategy6}{text}{/strategy6}</w:t>
-      </w:r>
-    </w:p>
-    <w:p>
-      <w:pPr>
-        <w:pStyle w:val="a7"/>
-        <w:numPr>
-          <w:ilvl w:val="0"/>
-          <w:numId w:val="12"/>
-        </w:numPr>
         <w:spacing w:before="100" w:beforeAutospacing="1" w:after="100" w:afterAutospacing="1"/>
-        <w:ind w:leftChars="0" w:left="426" w:hanging="426"/>
+        <w:ind/>
         <w:jc w:val="both"/>
         <w:rPr>
           <w:rFonts w:ascii="標楷體" w:eastAsia="標楷體" w:hAnsi="標楷體"/>
@@ -772,7 +641,7 @@
           <w:sz w:val="26"/>
           <w:szCs w:val="26"/>
         </w:rPr>
-        <w:t>譚文志</w:t>
+        <w:t>{counselorName}</w:t>
       </w:r>
       <w:proofErr w:type="gramStart"/>
       <w:r>
@@ -798,7 +667,7 @@
           <w:sz w:val="26"/>
           <w:szCs w:val="26"/>
         </w:rPr>
-        <w:t>233</w:t>
+        <w:t>{counselorExtension}</w:t>
       </w:r>
       <w:r>
         <w:rPr>
@@ -806,7 +675,7 @@
           <w:sz w:val="26"/>
           <w:szCs w:val="26"/>
         </w:rPr>
-        <w:t>7</w:t>
+        <w:t/>
       </w:r>
       <w:proofErr w:type="gramStart"/>
       <w:r>
@@ -875,7 +744,7 @@
           <w:sz w:val="28"/>
           <w:szCs w:val="28"/>
         </w:rPr>
-        <w:t>文志</w:t>
+        <w:t>{counselorName}</w:t>
       </w:r>
       <w:r>
         <w:rPr>
@@ -884,7 +753,7 @@
           <w:sz w:val="28"/>
           <w:szCs w:val="28"/>
         </w:rPr>
-        <w:t>敬上(分機233</w:t>
+        <w:t>敬上(分機{counselorExtension}</w:t>
       </w:r>
       <w:r>
         <w:rPr>
@@ -893,7 +762,7 @@
           <w:sz w:val="28"/>
           <w:szCs w:val="28"/>
         </w:rPr>
-        <w:t>7</w:t>
+        <w:t/>
       </w:r>
       <w:r>
         <w:rPr>

</xml_diff>